<commit_message>
Set manuscript body font to Times New Roman size 11 (was 12)
Normal, headings, title page, header page number, and PDF preview all updated to
11pt Times New Roman.
</commit_message>
<xml_diff>
--- a/paper/research_paper.docx
+++ b/paper/research_paper.docx
@@ -13,7 +13,7 @@
         <w:rPr>
           <w:rFonts w:ascii="Times New Roman" w:hAnsi="Times New Roman"/>
           <w:b w:val="0"/>
-          <w:sz w:val="24"/>
+          <w:sz w:val="22"/>
         </w:rPr>
         <w:t>Cross-Sector Correlation Regimes and Their Impact on the Predictive Accuracy of Equity Price Forecasting Models</w:t>
       </w:r>
@@ -84,7 +84,7 @@
         <w:rPr>
           <w:rFonts w:ascii="Times New Roman" w:hAnsi="Times New Roman"/>
           <w:b w:val="0"/>
-          <w:sz w:val="24"/>
+          <w:sz w:val="22"/>
         </w:rPr>
         <w:t>Cross-Sector Correlation Regimes and Their Impact on the Predictive Accuracy of Equity Price Forecasting Models</w:t>
       </w:r>
@@ -99,14 +99,14 @@
         <w:rPr>
           <w:rFonts w:ascii="Times New Roman" w:hAnsi="Times New Roman"/>
           <w:b w:val="0"/>
-          <w:sz w:val="24"/>
+          <w:sz w:val="22"/>
         </w:rPr>
         <w:t>Aarav Vaidha</w:t>
       </w:r>
       <w:r>
         <w:rPr>
           <w:rFonts w:ascii="Times New Roman" w:hAnsi="Times New Roman"/>
-          <w:sz w:val="24"/>
+          <w:sz w:val="22"/>
           <w:vertAlign w:val="superscript"/>
         </w:rPr>
         <w:t>1</w:t>
@@ -122,7 +122,7 @@
         <w:rPr>
           <w:rFonts w:ascii="Times New Roman" w:hAnsi="Times New Roman"/>
           <w:b/>
-          <w:sz w:val="24"/>
+          <w:sz w:val="22"/>
         </w:rPr>
         <w:t>Guidance from Dr. Madjid Tavana, Distinguished Chair &amp; Professor of Business Analytics, La Salle University</w:t>
       </w:r>
@@ -158,14 +158,14 @@
         <w:rPr>
           <w:rFonts w:ascii="Times New Roman" w:hAnsi="Times New Roman"/>
           <w:b/>
-          <w:sz w:val="24"/>
+          <w:sz w:val="22"/>
         </w:rPr>
         <w:t xml:space="preserve">Keywords: </w:t>
       </w:r>
       <w:r>
         <w:rPr>
           <w:rFonts w:ascii="Times New Roman" w:hAnsi="Times New Roman"/>
-          <w:sz w:val="24"/>
+          <w:sz w:val="22"/>
         </w:rPr>
         <w:t>cross-sector correlation, realized volatility, regime analysis, out-of-sample forecasting, return predictability, volatility confound, Newey–West standard errors</w:t>
       </w:r>
@@ -10028,7 +10028,7 @@
     <w:r>
       <w:rPr>
         <w:rFonts w:ascii="Times New Roman" w:hAnsi="Times New Roman"/>
-        <w:sz w:val="24"/>
+        <w:sz w:val="22"/>
       </w:rPr>
       <w:fldChar w:fldCharType="begin"/>
       <w:instrText xml:space="preserve"> PAGE </w:instrText>
@@ -10741,7 +10741,7 @@
     <w:rPr>
       <w:rFonts w:ascii="Times New Roman" w:cs="Times New Roman" w:hAnsi="Times New Roman"/>
       <w:b w:val="0"/>
-      <w:sz w:val="24"/>
+      <w:sz w:val="22"/>
     </w:rPr>
   </w:style>
   <w:style w:styleId="Header" w:type="paragraph">
@@ -10808,7 +10808,7 @@
       <w:rFonts w:ascii="Times New Roman" w:asciiTheme="majorHAnsi" w:cs="Times New Roman" w:cstheme="majorBidi" w:eastAsiaTheme="majorEastAsia" w:hAnsi="Times New Roman" w:hAnsiTheme="majorHAnsi"/>
       <w:b/>
       <w:bCs/>
-      <w:sz w:val="24"/>
+      <w:sz w:val="22"/>
       <w:szCs w:val="28"/>
       <w:color w:val="000000"/>
     </w:rPr>
@@ -10834,7 +10834,7 @@
       <w:rFonts w:ascii="Times New Roman" w:asciiTheme="majorHAnsi" w:cs="Times New Roman" w:cstheme="majorBidi" w:eastAsiaTheme="majorEastAsia" w:hAnsi="Times New Roman" w:hAnsiTheme="majorHAnsi"/>
       <w:b/>
       <w:bCs/>
-      <w:sz w:val="24"/>
+      <w:sz w:val="22"/>
       <w:szCs w:val="26"/>
       <w:color w:val="000000"/>
     </w:rPr>
@@ -10860,7 +10860,7 @@
       <w:rFonts w:ascii="Times New Roman" w:asciiTheme="majorHAnsi" w:cs="Times New Roman" w:cstheme="majorBidi" w:eastAsiaTheme="majorEastAsia" w:hAnsi="Times New Roman" w:hAnsiTheme="majorHAnsi"/>
       <w:b/>
       <w:bCs/>
-      <w:sz w:val="24"/>
+      <w:sz w:val="22"/>
       <w:color w:val="000000"/>
     </w:rPr>
   </w:style>
@@ -10888,7 +10888,7 @@
       <w:bCs/>
       <w:i/>
       <w:iCs/>
-      <w:sz w:val="24"/>
+      <w:sz w:val="22"/>
       <w:color w:val="000000"/>
     </w:rPr>
   </w:style>

</xml_diff>

<commit_message>
Add AI-use disclosure statement before references
Discloses that Claude (Anthropic) assisted with code, analysis, figures, and
drafting; results reproduced from code; author responsible for final content.
Standard journal-required disclosure for AI-assisted work.
</commit_message>
<xml_diff>
--- a/paper/research_paper.docx
+++ b/paper/research_paper.docx
@@ -4340,7 +4340,32 @@
       </w:r>
     </w:p>
     <w:bookmarkEnd w:id="57"/>
-    <w:bookmarkStart w:id="58" w:name="references"/>
+    <w:bookmarkStart w:id="58" w:name="use-of-ai-tools"/>
+    <w:p>
+      <w:pPr>
+        <w:pStyle w:val="Heading2"/>
+      </w:pPr>
+      <w:r>
+        <w:t xml:space="preserve">Use of AI tools</w:t>
+      </w:r>
+    </w:p>
+    <w:p>
+      <w:pPr>
+        <w:pStyle w:val="FirstParagraph"/>
+      </w:pPr>
+      <w:r>
+        <w:t xml:space="preserve">The author used Claude (Anthropic), an AI assistant, to help write and debug the Python analysis code, run the statistical analyses, generate the figures, and draft and revise the manuscript. All results were reproduced from the code, and the author is responsible for the final content.</w:t>
+      </w:r>
+    </w:p>
+    <w:p>
+      <w:r>
+        <w:pict>
+          <v:rect style="width:0;height:1.5pt" o:hralign="center" o:hrstd="t" o:hr="t"/>
+        </w:pict>
+      </w:r>
+    </w:p>
+    <w:bookmarkEnd w:id="58"/>
+    <w:bookmarkStart w:id="59" w:name="references"/>
     <w:p>
       <w:pPr>
         <w:pStyle w:val="Heading2"/>
@@ -4806,8 +4831,8 @@
         </w:pict>
       </w:r>
     </w:p>
-    <w:bookmarkEnd w:id="58"/>
-    <w:bookmarkStart w:id="59" w:name="data-and-code"/>
+    <w:bookmarkEnd w:id="59"/>
+    <w:bookmarkStart w:id="60" w:name="data-and-code"/>
     <w:p>
       <w:pPr>
         <w:pStyle w:val="Heading2"/>
@@ -4863,7 +4888,7 @@
         <w:t xml:space="preserve">.</w:t>
       </w:r>
     </w:p>
-    <w:bookmarkEnd w:id="59"/>
+    <w:bookmarkEnd w:id="60"/>
     <w:sectPr>
       <w:headerReference r:id="rId9" w:type="default"/>
       <w:footerReference r:id="rId10" w:type="default"/>

</xml_diff>